<commit_message>
docs: 重新整理 error_cases.docx 排版
之前用 pandoc 默认模板转，无 CJK 字体 / 标题层级不清 / 表格无边框。
本次自定义 reference doc:
- 中文 Microsoft YaHei + 英文 Calibri + 等宽 Consolas
- Title 28pt / H1 22pt / H2 16pt / H3 13pt，H1/H2 深蓝 H3 中蓝
- Table 加边框 + 头行底纹
- 16 张表全部正常呈现，3 层标题层级清晰
</commit_message>
<xml_diff>
--- a/analysis/error_cases.docx
+++ b/analysis/error_cases.docx
@@ -8985,6 +8985,11 @@
   </w:docDefaults>
   <w:latentStyles w:defLockedState="0" w:defUIPriority="0" w:defSemiHidden="0" w:defUnhideWhenUsed="0" w:defQFormat="0" w:count="276"/>
   <w:style w:type="paragraph" w:default="1" w:styleId="Normal">
+    <w:rPr>
+      <w:rFonts w:ascii="Calibri" w:hAnsi="Calibri" w:cs="Calibri" w:eastAsia="Microsoft YaHei"/>
+      <w:sz w:val="21"/>
+      <w:szCs w:val="21"/>
+    </w:rPr>
     <w:name w:val="Normal"/>
     <w:qFormat/>
   </w:style>
@@ -9023,12 +9028,12 @@
       <w:jc w:val="center"/>
     </w:pPr>
     <w:rPr>
-      <w:rFonts w:asciiTheme="majorHAnsi" w:eastAsiaTheme="majorEastAsia" w:hAnsiTheme="majorHAnsi" w:cstheme="majorBidi"/>
-      <w:b/>
+      <w:rFonts w:asciiTheme="majorHAnsi" w:eastAsiaTheme="majorEastAsia" w:hAnsiTheme="majorHAnsi" w:cstheme="majorBidi" w:ascii="Calibri" w:hAnsi="Calibri" w:cs="Calibri" w:eastAsia="Microsoft YaHei"/>
+      <w:b w:val="1"/>
       <w:bCs/>
-      <w:color w:val="345A8A" w:themeColor="accent1" w:themeShade="B5"/>
-      <w:sz w:val="36"/>
-      <w:szCs w:val="36"/>
+      <w:color w:val="1F4E79" w:themeColor="accent1" w:themeShade="B5"/>
+      <w:sz w:val="56"/>
+      <w:szCs w:val="56"/>
     </w:rPr>
   </w:style>
   <w:style w:type="paragraph" w:styleId="Subtitle">
@@ -9103,12 +9108,12 @@
       <w:outlineLvl w:val="0"/>
     </w:pPr>
     <w:rPr>
-      <w:rFonts w:asciiTheme="majorHAnsi" w:eastAsiaTheme="majorEastAsia" w:hAnsiTheme="majorHAnsi" w:cstheme="majorBidi"/>
-      <w:b/>
+      <w:rFonts w:asciiTheme="majorHAnsi" w:eastAsiaTheme="majorEastAsia" w:hAnsiTheme="majorHAnsi" w:cstheme="majorBidi" w:ascii="Calibri" w:hAnsi="Calibri" w:cs="Calibri" w:eastAsia="Microsoft YaHei"/>
+      <w:b w:val="1"/>
       <w:bCs/>
-      <w:color w:val="4F81BD" w:themeColor="accent1"/>
-      <w:sz w:val="32"/>
-      <w:szCs w:val="32"/>
+      <w:color w:val="1F4E79" w:themeColor="accent1"/>
+      <w:sz w:val="44"/>
+      <w:szCs w:val="44"/>
     </w:rPr>
   </w:style>
   <w:style w:type="paragraph" w:styleId="Heading2">
@@ -9125,12 +9130,12 @@
       <w:outlineLvl w:val="1"/>
     </w:pPr>
     <w:rPr>
-      <w:rFonts w:asciiTheme="majorHAnsi" w:eastAsiaTheme="majorEastAsia" w:hAnsiTheme="majorHAnsi" w:cstheme="majorBidi"/>
-      <w:b/>
+      <w:rFonts w:asciiTheme="majorHAnsi" w:eastAsiaTheme="majorEastAsia" w:hAnsiTheme="majorHAnsi" w:cstheme="majorBidi" w:ascii="Calibri" w:hAnsi="Calibri" w:cs="Calibri" w:eastAsia="Microsoft YaHei"/>
+      <w:b w:val="1"/>
       <w:bCs/>
-      <w:color w:val="4F81BD" w:themeColor="accent1"/>
-      <w:sz w:val="28"/>
-      <w:szCs w:val="28"/>
+      <w:color w:val="1F4E79" w:themeColor="accent1"/>
+      <w:sz w:val="32"/>
+      <w:szCs w:val="32"/>
     </w:rPr>
   </w:style>
   <w:style w:type="paragraph" w:styleId="Heading3">
@@ -9147,12 +9152,12 @@
       <w:outlineLvl w:val="2"/>
     </w:pPr>
     <w:rPr>
-      <w:rFonts w:asciiTheme="majorHAnsi" w:eastAsiaTheme="majorEastAsia" w:hAnsiTheme="majorHAnsi" w:cstheme="majorBidi"/>
-      <w:b/>
+      <w:rFonts w:asciiTheme="majorHAnsi" w:eastAsiaTheme="majorEastAsia" w:hAnsiTheme="majorHAnsi" w:cstheme="majorBidi" w:ascii="Calibri" w:hAnsi="Calibri" w:cs="Calibri" w:eastAsia="Microsoft YaHei"/>
+      <w:b w:val="1"/>
       <w:bCs/>
-      <w:color w:val="4F81BD" w:themeColor="accent1"/>
-      <w:sz w:val="24"/>
-      <w:szCs w:val="24"/>
+      <w:color w:val="2E74B5" w:themeColor="accent1"/>
+      <w:sz w:val="26"/>
+      <w:szCs w:val="26"/>
     </w:rPr>
   </w:style>
   <w:style w:type="paragraph" w:styleId="Heading4">
@@ -9169,12 +9174,13 @@
       <w:outlineLvl w:val="3"/>
     </w:pPr>
     <w:rPr>
-      <w:rFonts w:asciiTheme="majorHAnsi" w:eastAsiaTheme="majorEastAsia" w:hAnsiTheme="majorHAnsi" w:cstheme="majorBidi"/>
+      <w:rFonts w:asciiTheme="majorHAnsi" w:eastAsiaTheme="majorEastAsia" w:hAnsiTheme="majorHAnsi" w:cstheme="majorBidi" w:ascii="Calibri" w:hAnsi="Calibri" w:cs="Calibri" w:eastAsia="Microsoft YaHei"/>
       <w:i/>
       <w:bCs/>
-      <w:color w:val="4F81BD" w:themeColor="accent1"/>
+      <w:color w:val="2E74B5" w:themeColor="accent1"/>
       <w:sz w:val="24"/>
       <w:szCs w:val="24"/>
+      <w:b w:val="1"/>
     </w:rPr>
   </w:style>
   <w:style w:type="paragraph" w:styleId="Heading5">
@@ -9304,20 +9310,35 @@
     <w:unhideWhenUsed/>
   </w:style>
   <w:style w:type="table" w:default="1" w:styleId="Table">
+    <w:tblPr>
+      <w:tblBorders>
+        <w:top w:val="single" w:sz="6" w:space="0" w:color="999999"/>
+        <w:left w:val="single" w:sz="6" w:space="0" w:color="999999"/>
+        <w:bottom w:val="single" w:sz="6" w:space="0" w:color="999999"/>
+        <w:right w:val="single" w:sz="6" w:space="0" w:color="999999"/>
+        <w:insideH w:val="single" w:sz="4" w:space="0" w:color="CCCCCC"/>
+        <w:insideV w:val="single" w:sz="4" w:space="0" w:color="CCCCCC"/>
+      </w:tblBorders>
+      <w:tblCellMar>
+        <w:top w:w="60" w:type="dxa"/>
+        <w:left w:w="100" w:type="dxa"/>
+        <w:bottom w:w="60" w:type="dxa"/>
+        <w:right w:w="100" w:type="dxa"/>
+      </w:tblCellMar>
+    </w:tblPr>
     <w:name w:val="Table"/>
     <w:basedOn w:val="TableNormal"/>
     <w:semiHidden/>
     <w:unhideWhenUsed/>
     <w:qFormat/>
-    <w:tblPr>
-      <w:tblInd w:w="0" w:type="dxa"/>
-      <w:tblCellMar>
-        <w:top w:w="0" w:type="dxa"/>
-        <w:left w:w="108" w:type="dxa"/>
-        <w:bottom w:w="0" w:type="dxa"/>
-        <w:right w:w="108" w:type="dxa"/>
-      </w:tblCellMar>
-    </w:tblPr>
+    <w:tblStylePr w:type="firstRow">
+      <w:rPr>
+        <w:b/>
+      </w:rPr>
+      <w:tcPr>
+        <w:shd w:val="clear" w:color="auto" w:fill="DEEAF6"/>
+      </w:tcPr>
+    </w:tblStylePr>
   </w:style>
   <w:style w:type="paragraph" w:customStyle="1" w:styleId="DefinitionTerm">
     <w:name w:val="Definition Term"/>
@@ -9378,8 +9399,9 @@
     <w:name w:val="Verbatim Char"/>
     <w:basedOn w:val="BodyTextChar"/>
     <w:rPr>
-      <w:rFonts w:ascii="Consolas" w:hAnsi="Consolas"/>
-      <w:sz w:val="22"/>
+      <w:rFonts w:ascii="Consolas" w:hAnsi="Consolas" w:cs="Consolas" w:eastAsia="Consolas"/>
+      <w:sz w:val="19"/>
+      <w:szCs w:val="19"/>
     </w:rPr>
   </w:style>
   <w:style w:type="character" w:customStyle="1" w:styleId="SectionNumber">

</xml_diff>

<commit_message>
docs: error_cases 改用中文术语 + 宋体/Times New Roman
术语本地化（读者看不懂英文术语）：
- tables / Tables → 表格
- examples / Examples → 示例
（仅替换叙述文字，反引号内的文件名 / 代码 / 路径不动；
  代码块全段保留原样。同时清理中文词左右多余空格。）

字体：
- 中文宋体 + 英文 Times New Roman + 代码 Consolas
- Title 28pt / H1 22pt / H2 16pt / H3 13pt 层级保留
- 表格边框 + 头行底纹保留
</commit_message>
<xml_diff>
--- a/analysis/error_cases.docx
+++ b/analysis/error_cases.docx
@@ -559,7 +559,7 @@
         <w:t xml:space="preserve">类型 A — URI 形式错误</w:t>
       </w:r>
     </w:p>
-    <w:bookmarkStart w:id="22" w:name="a1-uri-缺前导-5-条全在-examples-侧"/>
+    <w:bookmarkStart w:id="22" w:name="a1-uri-缺前导-5-条全在示例侧"/>
     <w:p>
       <w:pPr>
         <w:pStyle w:val="Heading3"/>
@@ -577,7 +577,7 @@
         <w:t xml:space="preserve">/</w:t>
       </w:r>
       <w:r>
-        <w:t xml:space="preserve">（5 条，全在 examples 侧）</w:t>
+        <w:t xml:space="preserve">（5 条，全在示例侧）</w:t>
       </w:r>
     </w:p>
     <w:tbl>
@@ -638,7 +638,7 @@
               <w:jc w:val="left"/>
             </w:pPr>
             <w:r>
-              <w:t xml:space="preserve">现 examples URI</w:t>
+              <w:t xml:space="preserve">现示例 URI</w:t>
             </w:r>
           </w:p>
         </w:tc>
@@ -1777,13 +1777,13 @@
       </w:r>
     </w:p>
     <w:bookmarkEnd w:id="24"/>
-    <w:bookmarkStart w:id="25" w:name="a4-uri-截断--不完整3-条全在-examples-侧"/>
+    <w:bookmarkStart w:id="25" w:name="a4-uri-截断--不完整3-条全在示例侧"/>
     <w:p>
       <w:pPr>
         <w:pStyle w:val="Heading3"/>
       </w:pPr>
       <w:r>
-        <w:t xml:space="preserve">A4. URI 截断 / 不完整（3 条，全在 examples 侧）</w:t>
+        <w:t xml:space="preserve">A4. URI 截断 / 不完整（3 条，全在示例侧）</w:t>
       </w:r>
     </w:p>
     <w:tbl>
@@ -1844,7 +1844,7 @@
               <w:jc w:val="left"/>
             </w:pPr>
             <w:r>
-              <w:t xml:space="preserve">现 examples URI</w:t>
+              <w:t xml:space="preserve">现示例 URI</w:t>
             </w:r>
           </w:p>
         </w:tc>
@@ -2054,13 +2054,13 @@
       </w:tr>
     </w:tbl>
     <w:bookmarkEnd w:id="25"/>
-    <w:bookmarkStart w:id="26" w:name="a5-uri-拼写错6-条examples-侧"/>
+    <w:bookmarkStart w:id="26" w:name="a5-uri-拼写错6-条示例侧"/>
     <w:p>
       <w:pPr>
         <w:pStyle w:val="Heading3"/>
       </w:pPr>
       <w:r>
-        <w:t xml:space="preserve">A5. URI 拼写错（6 条，examples 侧）</w:t>
+        <w:t xml:space="preserve">A5. URI 拼写错（6 条，示例侧）</w:t>
       </w:r>
     </w:p>
     <w:tbl>
@@ -2587,7 +2587,7 @@
               <w:jc w:val="left"/>
             </w:pPr>
             <w:r>
-              <w:t xml:space="preserve">tables（应为模板）</w:t>
+              <w:t xml:space="preserve">表格（应为模板）</w:t>
             </w:r>
           </w:p>
         </w:tc>
@@ -2604,7 +2604,7 @@
               <w:jc w:val="left"/>
             </w:pPr>
             <w:r>
-              <w:t xml:space="preserve">examples（被替换成实例）</w:t>
+              <w:t xml:space="preserve">示例（被替换成实例）</w:t>
             </w:r>
           </w:p>
         </w:tc>
@@ -3265,7 +3265,7 @@
               <w:jc w:val="left"/>
             </w:pPr>
             <w:r>
-              <w:t xml:space="preserve">tables</w:t>
+              <w:t xml:space="preserve">表格</w:t>
             </w:r>
             <w:r>
               <w:t xml:space="preserve"> </w:t>
@@ -3280,7 +3280,7 @@
               <w:t xml:space="preserve"> </w:t>
             </w:r>
             <w:r>
-              <w:t xml:space="preserve">vs examples</w:t>
+              <w:t xml:space="preserve">vs 示例</w:t>
             </w:r>
             <w:r>
               <w:t xml:space="preserve"> </w:t>
@@ -3336,7 +3336,7 @@
               <w:jc w:val="left"/>
             </w:pPr>
             <w:r>
-              <w:t xml:space="preserve">tables 路径</w:t>
+              <w:t xml:space="preserve">表格路径</w:t>
             </w:r>
             <w:r>
               <w:t xml:space="preserve"> </w:t>
@@ -3351,7 +3351,7 @@
               <w:t xml:space="preserve"> </w:t>
             </w:r>
             <w:r>
-              <w:t xml:space="preserve">vs examples 路径</w:t>
+              <w:t xml:space="preserve">vs 示例路径</w:t>
             </w:r>
             <w:r>
               <w:t xml:space="preserve"> </w:t>
@@ -3405,7 +3405,7 @@
               <w:jc w:val="left"/>
             </w:pPr>
             <w:r>
-              <w:t xml:space="preserve">tables</w:t>
+              <w:t xml:space="preserve">表格</w:t>
             </w:r>
             <w:r>
               <w:t xml:space="preserve"> </w:t>
@@ -3420,7 +3420,7 @@
               <w:t xml:space="preserve"> </w:t>
             </w:r>
             <w:r>
-              <w:t xml:space="preserve">vs examples</w:t>
+              <w:t xml:space="preserve">vs 示例</w:t>
             </w:r>
             <w:r>
               <w:t xml:space="preserve"> </w:t>
@@ -3524,7 +3524,7 @@
               <w:jc w:val="left"/>
             </w:pPr>
             <w:r>
-              <w:t xml:space="preserve">tables</w:t>
+              <w:t xml:space="preserve">表格</w:t>
             </w:r>
             <w:r>
               <w:t xml:space="preserve"> </w:t>
@@ -3539,7 +3539,7 @@
               <w:t xml:space="preserve"> </w:t>
             </w:r>
             <w:r>
-              <w:t xml:space="preserve">vs examples</w:t>
+              <w:t xml:space="preserve">vs 示例</w:t>
             </w:r>
             <w:r>
               <w:t xml:space="preserve"> </w:t>
@@ -3558,7 +3558,7 @@
                 <w:bCs/>
                 <w:b/>
               </w:rPr>
-              <w:t xml:space="preserve">examples 多了一段错误路径</w:t>
+              <w:t xml:space="preserve">示例多了一段错误路径</w:t>
             </w:r>
           </w:p>
         </w:tc>
@@ -3593,7 +3593,7 @@
               <w:jc w:val="left"/>
             </w:pPr>
             <w:r>
-              <w:t xml:space="preserve">tables 是 POST，examples 是 GET；URI 缺</w:t>
+              <w:t xml:space="preserve">表格是 POST，示例是 GET；URI 缺</w:t>
             </w:r>
             <w:r>
               <w:t xml:space="preserve"> </w:t>
@@ -3667,7 +3667,7 @@
               <w:jc w:val="left"/>
             </w:pPr>
             <w:r>
-              <w:t xml:space="preserve">tables</w:t>
+              <w:t xml:space="preserve">表格</w:t>
             </w:r>
             <w:r>
               <w:t xml:space="preserve"> </w:t>
@@ -3682,7 +3682,7 @@
               <w:t xml:space="preserve"> </w:t>
             </w:r>
             <w:r>
-              <w:t xml:space="preserve">vs examples</w:t>
+              <w:t xml:space="preserve">vs 示例</w:t>
             </w:r>
             <w:r>
               <w:t xml:space="preserve"> </w:t>
@@ -3860,7 +3860,7 @@
               <w:jc w:val="left"/>
             </w:pPr>
             <w:r>
-              <w:t xml:space="preserve">tables</w:t>
+              <w:t xml:space="preserve">表格</w:t>
             </w:r>
             <w:r>
               <w:t xml:space="preserve"> </w:t>
@@ -3875,7 +3875,7 @@
               <w:t xml:space="preserve"> </w:t>
             </w:r>
             <w:r>
-              <w:t xml:space="preserve">vs examples</w:t>
+              <w:t xml:space="preserve">vs 示例</w:t>
             </w:r>
             <w:r>
               <w:t xml:space="preserve"> </w:t>
@@ -3887,7 +3887,7 @@
               <w:t xml:space="preserve">/redfish/v1/TaskService/Tasks/{taskid}</w:t>
             </w:r>
             <w:r>
-              <w:t xml:space="preserve">——examples 写错成单任务路径</w:t>
+              <w:t xml:space="preserve">——示例写错成单任务路径</w:t>
             </w:r>
           </w:p>
         </w:tc>
@@ -3922,7 +3922,7 @@
               <w:jc w:val="left"/>
             </w:pPr>
             <w:r>
-              <w:t xml:space="preserve">examples 缺一段（A2</w:t>
+              <w:t xml:space="preserve">示例缺一段（A2</w:t>
             </w:r>
             <w:r>
               <w:t xml:space="preserve"> </w:t>
@@ -4011,7 +4011,7 @@
               <w:jc w:val="left"/>
             </w:pPr>
             <w:r>
-              <w:t xml:space="preserve">tables method</w:t>
+              <w:t xml:space="preserve">表格 method</w:t>
             </w:r>
           </w:p>
         </w:tc>
@@ -4028,7 +4028,7 @@
               <w:jc w:val="left"/>
             </w:pPr>
             <w:r>
-              <w:t xml:space="preserve">examples method</w:t>
+              <w:t xml:space="preserve">示例 method</w:t>
             </w:r>
           </w:p>
         </w:tc>
@@ -4109,7 +4109,7 @@
                 <w:bCs/>
                 <w:b/>
               </w:rPr>
-              <w:t xml:space="preserve">改 tables</w:t>
+              <w:t xml:space="preserve">改表格</w:t>
             </w:r>
           </w:p>
         </w:tc>
@@ -4173,7 +4173,7 @@
                 <w:bCs/>
                 <w:b/>
               </w:rPr>
-              <w:t xml:space="preserve">改 examples</w:t>
+              <w:t xml:space="preserve">改示例</w:t>
             </w:r>
           </w:p>
         </w:tc>
@@ -4237,7 +4237,7 @@
                 <w:bCs/>
                 <w:b/>
               </w:rPr>
-              <w:t xml:space="preserve">改 examples</w:t>
+              <w:t xml:space="preserve">改示例</w:t>
             </w:r>
           </w:p>
         </w:tc>
@@ -4301,7 +4301,7 @@
                 <w:bCs/>
                 <w:b/>
               </w:rPr>
-              <w:t xml:space="preserve">改 examples</w:t>
+              <w:t xml:space="preserve">改示例</w:t>
             </w:r>
           </w:p>
         </w:tc>
@@ -4365,7 +4365,7 @@
                 <w:bCs/>
                 <w:b/>
               </w:rPr>
-              <w:t xml:space="preserve">改 examples</w:t>
+              <w:t xml:space="preserve">改示例</w:t>
             </w:r>
           </w:p>
         </w:tc>
@@ -4429,7 +4429,7 @@
                 <w:bCs/>
                 <w:b/>
               </w:rPr>
-              <w:t xml:space="preserve">改 examples</w:t>
+              <w:t xml:space="preserve">改示例</w:t>
             </w:r>
           </w:p>
         </w:tc>
@@ -4453,13 +4453,13 @@
         <w:t xml:space="preserve">类型 B — 参数名拼写 / 空格</w:t>
       </w:r>
     </w:p>
-    <w:bookmarkStart w:id="31" w:name="b1-参数名前后含空格4-处examples-侧-json-实际写法"/>
+    <w:bookmarkStart w:id="31" w:name="b1-参数名前后含空格4-处示例侧-json-实际写法"/>
     <w:p>
       <w:pPr>
         <w:pStyle w:val="Heading3"/>
       </w:pPr>
       <w:r>
-        <w:t xml:space="preserve">B1. 参数名前后含空格（4 处，examples 侧 JSON 实际写法）</w:t>
+        <w:t xml:space="preserve">B1. 参数名前后含空格（4 处，示例侧 JSON 实际写法）</w:t>
       </w:r>
     </w:p>
     <w:tbl>
@@ -4896,7 +4896,7 @@
               <w:jc w:val="left"/>
             </w:pPr>
             <w:r>
-              <w:t xml:space="preserve">examples 多了一行</w:t>
+              <w:t xml:space="preserve">示例多了一行</w:t>
             </w:r>
           </w:p>
         </w:tc>
@@ -4971,7 +4971,7 @@
               <w:jc w:val="left"/>
             </w:pPr>
             <w:r>
-              <w:t xml:space="preserve">examples</w:t>
+              <w:t xml:space="preserve">示例</w:t>
             </w:r>
           </w:p>
         </w:tc>
@@ -5034,7 +5034,7 @@
               <w:jc w:val="left"/>
             </w:pPr>
             <w:r>
-              <w:t xml:space="preserve">tables</w:t>
+              <w:t xml:space="preserve">表格</w:t>
             </w:r>
           </w:p>
         </w:tc>
@@ -5097,7 +5097,7 @@
               <w:jc w:val="left"/>
             </w:pPr>
             <w:r>
-              <w:t xml:space="preserve">tables</w:t>
+              <w:t xml:space="preserve">表格</w:t>
             </w:r>
           </w:p>
         </w:tc>
@@ -5160,7 +5160,7 @@
               <w:jc w:val="left"/>
             </w:pPr>
             <w:r>
-              <w:t xml:space="preserve">examples</w:t>
+              <w:t xml:space="preserve">示例</w:t>
             </w:r>
           </w:p>
         </w:tc>
@@ -5223,7 +5223,7 @@
               <w:jc w:val="left"/>
             </w:pPr>
             <w:r>
-              <w:t xml:space="preserve">tables</w:t>
+              <w:t xml:space="preserve">表格</w:t>
             </w:r>
           </w:p>
         </w:tc>
@@ -5286,7 +5286,7 @@
               <w:jc w:val="left"/>
             </w:pPr>
             <w:r>
-              <w:t xml:space="preserve">tables</w:t>
+              <w:t xml:space="preserve">表格</w:t>
             </w:r>
           </w:p>
         </w:tc>
@@ -5349,7 +5349,7 @@
               <w:jc w:val="left"/>
             </w:pPr>
             <w:r>
-              <w:t xml:space="preserve">tables</w:t>
+              <w:t xml:space="preserve">表格</w:t>
             </w:r>
           </w:p>
         </w:tc>
@@ -5412,7 +5412,7 @@
               <w:jc w:val="left"/>
             </w:pPr>
             <w:r>
-              <w:t xml:space="preserve">tables</w:t>
+              <w:t xml:space="preserve">表格</w:t>
             </w:r>
           </w:p>
         </w:tc>
@@ -5475,7 +5475,7 @@
               <w:jc w:val="left"/>
             </w:pPr>
             <w:r>
-              <w:t xml:space="preserve">tables</w:t>
+              <w:t xml:space="preserve">表格</w:t>
             </w:r>
           </w:p>
         </w:tc>
@@ -5538,7 +5538,7 @@
               <w:jc w:val="left"/>
             </w:pPr>
             <w:r>
-              <w:t xml:space="preserve">tables</w:t>
+              <w:t xml:space="preserve">表格</w:t>
             </w:r>
           </w:p>
         </w:tc>
@@ -5640,7 +5640,7 @@
               <w:jc w:val="left"/>
             </w:pPr>
             <w:r>
-              <w:t xml:space="preserve">tables</w:t>
+              <w:t xml:space="preserve">表格</w:t>
             </w:r>
           </w:p>
         </w:tc>
@@ -5657,7 +5657,7 @@
               <w:jc w:val="left"/>
             </w:pPr>
             <w:r>
-              <w:t xml:space="preserve">examples</w:t>
+              <w:t xml:space="preserve">示例</w:t>
             </w:r>
           </w:p>
         </w:tc>
@@ -5767,7 +5767,7 @@
               <w:jc w:val="left"/>
             </w:pPr>
             <w:r>
-              <w:t xml:space="preserve">改 tables，统一用小写（与 Redfish 规范一致）</w:t>
+              <w:t xml:space="preserve">改表格，统一用小写（与 Redfish 规范一致）</w:t>
             </w:r>
           </w:p>
         </w:tc>
@@ -5860,7 +5860,7 @@
               <w:jc w:val="left"/>
             </w:pPr>
             <w:r>
-              <w:t xml:space="preserve">examples JSON 用小写，但 Redfish 规范应大写</w:t>
+              <w:t xml:space="preserve">示例 JSON 用小写，但 Redfish 规范应大写</w:t>
             </w:r>
             <w:r>
               <w:t xml:space="preserve"> </w:t>
@@ -5894,7 +5894,7 @@
                 <w:bCs/>
                 <w:b/>
               </w:rPr>
-              <w:t xml:space="preserve">改 examples</w:t>
+              <w:t xml:space="preserve">改示例</w:t>
             </w:r>
           </w:p>
         </w:tc>
@@ -5957,7 +5957,7 @@
               <w:jc w:val="left"/>
             </w:pPr>
             <w:r>
-              <w:t xml:space="preserve">examples 大小写错，改 examples</w:t>
+              <w:t xml:space="preserve">示例大小写错，改示例</w:t>
             </w:r>
           </w:p>
         </w:tc>
@@ -5993,7 +5993,7 @@
         <w:t xml:space="preserve">现象</w:t>
       </w:r>
       <w:r>
-        <w:t xml:space="preserve">：tables 表里写不带前缀的</w:t>
+        <w:t xml:space="preserve">：表格表里写不带前缀的</w:t>
       </w:r>
       <w:r>
         <w:t xml:space="preserve"> </w:t>
@@ -6014,7 +6014,7 @@
         <w:t xml:space="preserve">Redfish.ActionInfo</w:t>
       </w:r>
       <w:r>
-        <w:t xml:space="preserve">，examples JSON 里则按 Redfish 规范写</w:t>
+        <w:t xml:space="preserve">，示例 JSON 里则按 Redfish 规范写</w:t>
       </w:r>
       <w:r>
         <w:t xml:space="preserve"> </w:t>
@@ -6094,7 +6094,7 @@
               <w:jc w:val="left"/>
             </w:pPr>
             <w:r>
-              <w:t xml:space="preserve">tables 写法</w:t>
+              <w:t xml:space="preserve">表格写法</w:t>
             </w:r>
           </w:p>
         </w:tc>
@@ -6111,7 +6111,7 @@
               <w:jc w:val="left"/>
             </w:pPr>
             <w:r>
-              <w:t xml:space="preserve">examples 写法</w:t>
+              <w:t xml:space="preserve">示例写法</w:t>
             </w:r>
           </w:p>
         </w:tc>
@@ -6492,7 +6492,7 @@
         <w:t xml:space="preserve">建议</w:t>
       </w:r>
       <w:r>
-        <w:t xml:space="preserve">：tables 表里所有 Action 字段名补</w:t>
+        <w:t xml:space="preserve">：表格表里所有 Action 字段名补</w:t>
       </w:r>
       <w:r>
         <w:t xml:space="preserve"> </w:t>
@@ -6826,7 +6826,7 @@
         <w:t xml:space="preserve">影响</w:t>
       </w:r>
       <w:r>
-        <w:t xml:space="preserve">：之前 tables 解析工具不识别带空格的形式，多组响应表全部漏抓（4.2.39 漏 180 字段 / 4.4.27 漏一部分）。已在 extractor 侧修复。</w:t>
+        <w:t xml:space="preserve">：之前表格解析工具不识别带空格的形式，多组响应表全部漏抓（4.2.39 漏 180 字段 / 4.4.27 漏一部分）。已在 extractor 侧修复。</w:t>
       </w:r>
     </w:p>
     <w:p>
@@ -7053,7 +7053,7 @@
         <w:t xml:space="preserve">影响</w:t>
       </w:r>
       <w:r>
-        <w:t xml:space="preserve">：tables 抓出 response=0，examples 抓出 response=60+，对比时显示差异巨大。</w:t>
+        <w:t xml:space="preserve">：表格抓出 response=0，示例抓出 response=60+，对比时显示差异巨大。</w:t>
       </w:r>
     </w:p>
     <w:p>
@@ -7733,7 +7733,7 @@
         <w:t xml:space="preserve">不算 doc bug</w:t>
       </w:r>
       <w:r>
-        <w:t xml:space="preserve">：tables 写完整 schema、examples 只展示一种典型响应——这是 schema vs 实例的本质差异。</w:t>
+        <w:t xml:space="preserve">：表格写完整 schema、示例只展示一种典型响应——这是 schema vs 实例的本质差异。</w:t>
       </w:r>
     </w:p>
     <w:p>
@@ -7816,7 +7816,7 @@
               <w:jc w:val="right"/>
             </w:pPr>
             <w:r>
-              <w:t xml:space="preserve">tables response</w:t>
+              <w:t xml:space="preserve">表格 response</w:t>
             </w:r>
           </w:p>
         </w:tc>
@@ -7833,7 +7833,7 @@
               <w:jc w:val="right"/>
             </w:pPr>
             <w:r>
-              <w:t xml:space="preserve">examples response</w:t>
+              <w:t xml:space="preserve">示例 response</w:t>
             </w:r>
           </w:p>
         </w:tc>
@@ -8986,7 +8986,7 @@
   <w:latentStyles w:defLockedState="0" w:defUIPriority="0" w:defSemiHidden="0" w:defUnhideWhenUsed="0" w:defQFormat="0" w:count="276"/>
   <w:style w:type="paragraph" w:default="1" w:styleId="Normal">
     <w:rPr>
-      <w:rFonts w:ascii="Calibri" w:hAnsi="Calibri" w:cs="Calibri" w:eastAsia="Microsoft YaHei"/>
+      <w:rFonts w:ascii="Times New Roman" w:hAnsi="Times New Roman" w:cs="Times New Roman" w:eastAsia="宋体"/>
       <w:sz w:val="21"/>
       <w:szCs w:val="21"/>
     </w:rPr>
@@ -9028,7 +9028,7 @@
       <w:jc w:val="center"/>
     </w:pPr>
     <w:rPr>
-      <w:rFonts w:asciiTheme="majorHAnsi" w:eastAsiaTheme="majorEastAsia" w:hAnsiTheme="majorHAnsi" w:cstheme="majorBidi" w:ascii="Calibri" w:hAnsi="Calibri" w:cs="Calibri" w:eastAsia="Microsoft YaHei"/>
+      <w:rFonts w:asciiTheme="majorHAnsi" w:eastAsiaTheme="majorEastAsia" w:hAnsiTheme="majorHAnsi" w:cstheme="majorBidi" w:ascii="Times New Roman" w:hAnsi="Times New Roman" w:cs="Times New Roman" w:eastAsia="宋体"/>
       <w:b w:val="1"/>
       <w:bCs/>
       <w:color w:val="1F4E79" w:themeColor="accent1" w:themeShade="B5"/>
@@ -9108,7 +9108,7 @@
       <w:outlineLvl w:val="0"/>
     </w:pPr>
     <w:rPr>
-      <w:rFonts w:asciiTheme="majorHAnsi" w:eastAsiaTheme="majorEastAsia" w:hAnsiTheme="majorHAnsi" w:cstheme="majorBidi" w:ascii="Calibri" w:hAnsi="Calibri" w:cs="Calibri" w:eastAsia="Microsoft YaHei"/>
+      <w:rFonts w:asciiTheme="majorHAnsi" w:eastAsiaTheme="majorEastAsia" w:hAnsiTheme="majorHAnsi" w:cstheme="majorBidi" w:ascii="Times New Roman" w:hAnsi="Times New Roman" w:cs="Times New Roman" w:eastAsia="宋体"/>
       <w:b w:val="1"/>
       <w:bCs/>
       <w:color w:val="1F4E79" w:themeColor="accent1"/>
@@ -9130,7 +9130,7 @@
       <w:outlineLvl w:val="1"/>
     </w:pPr>
     <w:rPr>
-      <w:rFonts w:asciiTheme="majorHAnsi" w:eastAsiaTheme="majorEastAsia" w:hAnsiTheme="majorHAnsi" w:cstheme="majorBidi" w:ascii="Calibri" w:hAnsi="Calibri" w:cs="Calibri" w:eastAsia="Microsoft YaHei"/>
+      <w:rFonts w:asciiTheme="majorHAnsi" w:eastAsiaTheme="majorEastAsia" w:hAnsiTheme="majorHAnsi" w:cstheme="majorBidi" w:ascii="Times New Roman" w:hAnsi="Times New Roman" w:cs="Times New Roman" w:eastAsia="宋体"/>
       <w:b w:val="1"/>
       <w:bCs/>
       <w:color w:val="1F4E79" w:themeColor="accent1"/>
@@ -9152,7 +9152,7 @@
       <w:outlineLvl w:val="2"/>
     </w:pPr>
     <w:rPr>
-      <w:rFonts w:asciiTheme="majorHAnsi" w:eastAsiaTheme="majorEastAsia" w:hAnsiTheme="majorHAnsi" w:cstheme="majorBidi" w:ascii="Calibri" w:hAnsi="Calibri" w:cs="Calibri" w:eastAsia="Microsoft YaHei"/>
+      <w:rFonts w:asciiTheme="majorHAnsi" w:eastAsiaTheme="majorEastAsia" w:hAnsiTheme="majorHAnsi" w:cstheme="majorBidi" w:ascii="Times New Roman" w:hAnsi="Times New Roman" w:cs="Times New Roman" w:eastAsia="宋体"/>
       <w:b w:val="1"/>
       <w:bCs/>
       <w:color w:val="2E74B5" w:themeColor="accent1"/>
@@ -9174,7 +9174,7 @@
       <w:outlineLvl w:val="3"/>
     </w:pPr>
     <w:rPr>
-      <w:rFonts w:asciiTheme="majorHAnsi" w:eastAsiaTheme="majorEastAsia" w:hAnsiTheme="majorHAnsi" w:cstheme="majorBidi" w:ascii="Calibri" w:hAnsi="Calibri" w:cs="Calibri" w:eastAsia="Microsoft YaHei"/>
+      <w:rFonts w:asciiTheme="majorHAnsi" w:eastAsiaTheme="majorEastAsia" w:hAnsiTheme="majorHAnsi" w:cstheme="majorBidi" w:ascii="Times New Roman" w:hAnsi="Times New Roman" w:cs="Times New Roman" w:eastAsia="宋体"/>
       <w:i/>
       <w:bCs/>
       <w:color w:val="2E74B5" w:themeColor="accent1"/>

</xml_diff>